<commit_message>
Finalize reports in Russian and document formats
- Russian theoretical and practical reports (MD, DOCX at 12 pt/1.5, PDF)
- compact horizontal CI/CD diagram with Russian labels
- fill submission date, remove redundant retag step in workflow

Co-Authored-By: Claude Code <noreply@anthropic.com>
</commit_message>
<xml_diff>
--- a/report/practical-report.docx
+++ b/report/practical-report.docx
@@ -40,10 +40,7 @@
         <w:t xml:space="preserve"> </w:t>
       </w:r>
       <w:r>
-        <w:t xml:space="preserve">Дата:</w:t>
-      </w:r>
-      <w:r>
-        <w:t xml:space="preserve"> </w:t>
+        <w:t xml:space="preserve">Дата: 28 октября 2026</w:t>
       </w:r>
     </w:p>
     <w:bookmarkStart w:id="9" w:name="проект"/>

</xml_diff>

<commit_message>
Add repository link and author to reports
Co-Authored-By: Claude Code <noreply@anthropic.com>
</commit_message>
<xml_diff>
--- a/report/practical-report.docx
+++ b/report/practical-report.docx
@@ -16,25 +16,13 @@
         <w:pStyle w:val="FirstParagraph"/>
       </w:pPr>
       <w:r>
-        <w:t xml:space="preserve">Автор:</w:t>
-      </w:r>
-      <w:r>
-        <w:t xml:space="preserve"> </w:t>
-      </w:r>
-      <w:r>
-        <w:t xml:space="preserve"> </w:t>
-      </w:r>
-      <w:r>
-        <w:t xml:space="preserve">Репозиторий:</w:t>
-      </w:r>
-      <w:r>
-        <w:t xml:space="preserve"> </w:t>
-      </w:r>
-      <w:r>
-        <w:rPr>
-          <w:rStyle w:val="VerbatimChar"/>
-        </w:rPr>
-        <w:t xml:space="preserve">&lt;ССЫЛКА_НА_РЕПОЗИТОРИЙ&gt;</w:t>
+        <w:t xml:space="preserve">Автор: gybraty</w:t>
+      </w:r>
+      <w:r>
+        <w:t xml:space="preserve"> </w:t>
+      </w:r>
+      <w:r>
+        <w:t xml:space="preserve">Репозиторий: https://github.com/gybraty/iris-classifier-ci</w:t>
       </w:r>
       <w:r>
         <w:t xml:space="preserve"> </w:t>

</xml_diff>

<commit_message>
Add CI run screenshots to the practical report appendix
Co-Authored-By: Claude Code <noreply@anthropic.com>
</commit_message>
<xml_diff>
--- a/report/practical-report.docx
+++ b/report/practical-report.docx
@@ -2,7 +2,7 @@
 <file path=word/document.xml><?xml version="1.0" encoding="utf-8"?>
 <w:document xmlns:w="http://schemas.openxmlformats.org/wordprocessingml/2006/main" xmlns:m="http://schemas.openxmlformats.org/officeDocument/2006/math" xmlns:r="http://schemas.openxmlformats.org/officeDocument/2006/relationships" xmlns:o="urn:schemas-microsoft-com:office:office" xmlns:v="urn:schemas-microsoft-com:vml" xmlns:w10="urn:schemas-microsoft-com:office:word" xmlns:a="http://schemas.openxmlformats.org/drawingml/2006/main" xmlns:pic="http://schemas.openxmlformats.org/drawingml/2006/picture" xmlns:wp="http://schemas.openxmlformats.org/drawingml/2006/wordprocessingDrawing">
   <w:body>
-    <w:bookmarkStart w:id="17" w:name="X33245fbb24b90d793328635e71973c7629692ff"/>
+    <w:bookmarkStart w:id="26" w:name="X33245fbb24b90d793328635e71973c7629692ff"/>
     <w:p>
       <w:pPr>
         <w:pStyle w:val="Heading1"/>
@@ -1134,7 +1134,7 @@
       </w:r>
     </w:p>
     <w:bookmarkEnd w:id="15"/>
-    <w:bookmarkStart w:id="16" w:name="приложение-а.-скриншоты"/>
+    <w:bookmarkStart w:id="25" w:name="приложение-а.-скриншоты"/>
     <w:p>
       <w:pPr>
         <w:pStyle w:val="Heading2"/>
@@ -1143,411 +1143,259 @@
         <w:t xml:space="preserve">Приложение А. Скриншоты</w:t>
       </w:r>
     </w:p>
-    <w:tbl>
-      <w:tblPr>
-        <w:tblStyle w:val="Table"/>
-        <w:tblW w:type="pct" w:w="5000"/>
-        <w:tblLayout w:type="fixed"/>
-        <w:tblLook w:firstRow="1" w:lastRow="0" w:firstColumn="0" w:lastColumn="0" w:noHBand="0" w:noVBand="0" w:val="0020"/>
-      </w:tblPr>
-      <w:tblGrid>
-        <w:gridCol w:w="2640"/>
-        <w:gridCol w:w="2640"/>
-        <w:gridCol w:w="2640"/>
-      </w:tblGrid>
-      <w:tr>
-        <w:trPr>
-          <w:tblHeader w:val="on"/>
-        </w:trPr>
-        <w:tc>
-          <w:tcPr/>
-          <w:p>
-            <w:pPr>
-              <w:pStyle w:val="Compact"/>
-            </w:pPr>
-            <w:r>
-              <w:t xml:space="preserve">№</w:t>
-            </w:r>
-          </w:p>
-        </w:tc>
-        <w:tc>
-          <w:tcPr/>
-          <w:p>
-            <w:pPr>
-              <w:pStyle w:val="Compact"/>
-            </w:pPr>
-            <w:r>
-              <w:t xml:space="preserve">Файл</w:t>
-            </w:r>
-          </w:p>
-        </w:tc>
-        <w:tc>
-          <w:tcPr/>
-          <w:p>
-            <w:pPr>
-              <w:pStyle w:val="Compact"/>
-            </w:pPr>
-            <w:r>
-              <w:t xml:space="preserve">Что показывает</w:t>
-            </w:r>
-          </w:p>
-        </w:tc>
-      </w:tr>
-      <w:tr>
-        <w:tc>
-          <w:tcPr/>
-          <w:p>
-            <w:pPr>
-              <w:pStyle w:val="Compact"/>
-            </w:pPr>
-            <w:r>
-              <w:t xml:space="preserve">1</w:t>
-            </w:r>
-          </w:p>
-        </w:tc>
-        <w:tc>
-          <w:tcPr/>
-          <w:p>
-            <w:pPr>
-              <w:pStyle w:val="Compact"/>
-            </w:pPr>
-            <w:r>
-              <w:rPr>
-                <w:rStyle w:val="VerbatimChar"/>
-              </w:rPr>
-              <w:t xml:space="preserve">docs/screenshots/01-repo.png</w:t>
-            </w:r>
-          </w:p>
-        </w:tc>
-        <w:tc>
-          <w:tcPr/>
-          <w:p>
-            <w:pPr>
-              <w:pStyle w:val="Compact"/>
-            </w:pPr>
-            <w:r>
-              <w:t xml:space="preserve">Структура репозитория на GitHub</w:t>
-            </w:r>
-          </w:p>
-        </w:tc>
-      </w:tr>
-      <w:tr>
-        <w:tc>
-          <w:tcPr/>
-          <w:p>
-            <w:pPr>
-              <w:pStyle w:val="Compact"/>
-            </w:pPr>
-            <w:r>
-              <w:t xml:space="preserve">2</w:t>
-            </w:r>
-          </w:p>
-        </w:tc>
-        <w:tc>
-          <w:tcPr/>
-          <w:p>
-            <w:pPr>
-              <w:pStyle w:val="Compact"/>
-            </w:pPr>
-            <w:r>
-              <w:rPr>
-                <w:rStyle w:val="VerbatimChar"/>
-              </w:rPr>
-              <w:t xml:space="preserve">docs/screenshots/02-actions-run.png</w:t>
-            </w:r>
-          </w:p>
-        </w:tc>
-        <w:tc>
-          <w:tcPr/>
-          <w:p>
-            <w:pPr>
-              <w:pStyle w:val="Compact"/>
-            </w:pPr>
-            <w:r>
-              <w:t xml:space="preserve">Зелёный запуск workflow</w:t>
-            </w:r>
-          </w:p>
-        </w:tc>
-      </w:tr>
-      <w:tr>
-        <w:tc>
-          <w:tcPr/>
-          <w:p>
-            <w:pPr>
-              <w:pStyle w:val="Compact"/>
-            </w:pPr>
-            <w:r>
-              <w:t xml:space="preserve">3</w:t>
-            </w:r>
-          </w:p>
-        </w:tc>
-        <w:tc>
-          <w:tcPr/>
-          <w:p>
-            <w:pPr>
-              <w:pStyle w:val="Compact"/>
-            </w:pPr>
-            <w:r>
-              <w:rPr>
-                <w:rStyle w:val="VerbatimChar"/>
-              </w:rPr>
-              <w:t xml:space="preserve">docs/screenshots/03-test-log.png</w:t>
-            </w:r>
-          </w:p>
-        </w:tc>
-        <w:tc>
-          <w:tcPr/>
-          <w:p>
-            <w:pPr>
-              <w:pStyle w:val="Compact"/>
-            </w:pPr>
-            <w:r>
-              <w:rPr>
-                <w:rStyle w:val="VerbatimChar"/>
-              </w:rPr>
-              <w:t xml:space="preserve">11 passed</w:t>
-            </w:r>
-            <w:r>
-              <w:t xml:space="preserve"> </w:t>
-            </w:r>
-            <w:r>
-              <w:t xml:space="preserve">в логе test</w:t>
-            </w:r>
-          </w:p>
-        </w:tc>
-      </w:tr>
-      <w:tr>
-        <w:tc>
-          <w:tcPr/>
-          <w:p>
-            <w:pPr>
-              <w:pStyle w:val="Compact"/>
-            </w:pPr>
-            <w:r>
-              <w:t xml:space="preserve">4</w:t>
-            </w:r>
-          </w:p>
-        </w:tc>
-        <w:tc>
-          <w:tcPr/>
-          <w:p>
-            <w:pPr>
-              <w:pStyle w:val="Compact"/>
-            </w:pPr>
-            <w:r>
-              <w:rPr>
-                <w:rStyle w:val="VerbatimChar"/>
-              </w:rPr>
-              <w:t xml:space="preserve">docs/screenshots/04-dockerhub.png</w:t>
-            </w:r>
-          </w:p>
-        </w:tc>
-        <w:tc>
-          <w:tcPr/>
-          <w:p>
-            <w:pPr>
-              <w:pStyle w:val="Compact"/>
-            </w:pPr>
-            <w:r>
-              <w:t xml:space="preserve">Теги</w:t>
-            </w:r>
-            <w:r>
-              <w:t xml:space="preserve"> </w:t>
-            </w:r>
-            <w:r>
-              <w:rPr>
-                <w:rStyle w:val="VerbatimChar"/>
-              </w:rPr>
-              <w:t xml:space="preserve">:sha</w:t>
-            </w:r>
-            <w:r>
-              <w:t xml:space="preserve"> </w:t>
-            </w:r>
-            <w:r>
-              <w:t xml:space="preserve">и</w:t>
-            </w:r>
-            <w:r>
-              <w:t xml:space="preserve"> </w:t>
-            </w:r>
-            <w:r>
-              <w:rPr>
-                <w:rStyle w:val="VerbatimChar"/>
-              </w:rPr>
-              <w:t xml:space="preserve">:latest</w:t>
-            </w:r>
-          </w:p>
-        </w:tc>
-      </w:tr>
-      <w:tr>
-        <w:tc>
-          <w:tcPr/>
-          <w:p>
-            <w:pPr>
-              <w:pStyle w:val="Compact"/>
-            </w:pPr>
-            <w:r>
-              <w:t xml:space="preserve">5</w:t>
-            </w:r>
-          </w:p>
-        </w:tc>
-        <w:tc>
-          <w:tcPr/>
-          <w:p>
-            <w:pPr>
-              <w:pStyle w:val="Compact"/>
-            </w:pPr>
-            <w:r>
-              <w:rPr>
-                <w:rStyle w:val="VerbatimChar"/>
-              </w:rPr>
-              <w:t xml:space="preserve">docs/screenshots/05-kubectl.png</w:t>
-            </w:r>
-          </w:p>
-        </w:tc>
-        <w:tc>
-          <w:tcPr/>
-          <w:p>
-            <w:pPr>
-              <w:pStyle w:val="Compact"/>
-            </w:pPr>
-            <w:r>
-              <w:rPr>
-                <w:rStyle w:val="VerbatimChar"/>
-              </w:rPr>
-              <w:t xml:space="preserve">kubectl get pods,svc -n iris</w:t>
-            </w:r>
-          </w:p>
-        </w:tc>
-      </w:tr>
-      <w:tr>
-        <w:tc>
-          <w:tcPr/>
-          <w:p>
-            <w:pPr>
-              <w:pStyle w:val="Compact"/>
-            </w:pPr>
-            <w:r>
-              <w:t xml:space="preserve">6</w:t>
-            </w:r>
-          </w:p>
-        </w:tc>
-        <w:tc>
-          <w:tcPr/>
-          <w:p>
-            <w:pPr>
-              <w:pStyle w:val="Compact"/>
-            </w:pPr>
-            <w:r>
-              <w:rPr>
-                <w:rStyle w:val="VerbatimChar"/>
-              </w:rPr>
-              <w:t xml:space="preserve">docs/screenshots/06-api.png</w:t>
-            </w:r>
-          </w:p>
-        </w:tc>
-        <w:tc>
-          <w:tcPr/>
-          <w:p>
-            <w:pPr>
-              <w:pStyle w:val="Compact"/>
-            </w:pPr>
-            <w:r>
-              <w:t xml:space="preserve">Ответ</w:t>
-            </w:r>
-            <w:r>
-              <w:t xml:space="preserve"> </w:t>
-            </w:r>
-            <w:r>
-              <w:rPr>
-                <w:rStyle w:val="VerbatimChar"/>
-              </w:rPr>
-              <w:t xml:space="preserve">curl /predict</w:t>
-            </w:r>
-          </w:p>
-        </w:tc>
-      </w:tr>
-      <w:tr>
-        <w:tc>
-          <w:tcPr/>
-          <w:p>
-            <w:pPr>
-              <w:pStyle w:val="Compact"/>
-            </w:pPr>
-            <w:r>
-              <w:t xml:space="preserve">7</w:t>
-            </w:r>
-          </w:p>
-        </w:tc>
-        <w:tc>
-          <w:tcPr/>
-          <w:p>
-            <w:pPr>
-              <w:pStyle w:val="Compact"/>
-            </w:pPr>
-            <w:r>
-              <w:rPr>
-                <w:rStyle w:val="VerbatimChar"/>
-              </w:rPr>
-              <w:t xml:space="preserve">docs/screenshots/07-failed-run.png</w:t>
-            </w:r>
-          </w:p>
-        </w:tc>
-        <w:tc>
-          <w:tcPr/>
-          <w:p>
-            <w:pPr>
-              <w:pStyle w:val="Compact"/>
-            </w:pPr>
-            <w:r>
-              <w:t xml:space="preserve">Красный запуск (опционально)</w:t>
-            </w:r>
-          </w:p>
-        </w:tc>
-      </w:tr>
-    </w:tbl>
+    <w:p>
+      <w:pPr>
+        <w:pStyle w:val="CaptionedFigure"/>
+      </w:pPr>
+      <w:r>
+        <w:drawing>
+          <wp:inline>
+            <wp:extent cx="4027170" cy="4194968"/>
+            <wp:effectExtent b="0" l="0" r="0" t="0"/>
+            <wp:docPr descr="Рисунок А.1. Репозиторий проекта на GitHub" title="" id="17" name="Picture"/>
+            <a:graphic>
+              <a:graphicData uri="http://schemas.openxmlformats.org/drawingml/2006/picture">
+                <pic:pic>
+                  <pic:nvPicPr>
+                    <pic:cNvPr descr="../docs/screenshots/01-repo.png" id="18" name="Picture"/>
+                    <pic:cNvPicPr>
+                      <a:picLocks noChangeArrowheads="1" noChangeAspect="1"/>
+                    </pic:cNvPicPr>
+                  </pic:nvPicPr>
+                  <pic:blipFill>
+                    <a:blip r:embed="rId16"/>
+                    <a:stretch>
+                      <a:fillRect/>
+                    </a:stretch>
+                  </pic:blipFill>
+                  <pic:spPr bwMode="auto">
+                    <a:xfrm>
+                      <a:off x="0" y="0"/>
+                      <a:ext cx="4027170" cy="4194968"/>
+                    </a:xfrm>
+                    <a:prstGeom prst="rect">
+                      <a:avLst/>
+                    </a:prstGeom>
+                    <a:noFill/>
+                    <a:ln w="9525">
+                      <a:noFill/>
+                      <a:headEnd/>
+                      <a:tailEnd/>
+                    </a:ln>
+                  </pic:spPr>
+                </pic:pic>
+              </a:graphicData>
+            </a:graphic>
+          </wp:inline>
+        </w:drawing>
+      </w:r>
+    </w:p>
+    <w:p>
+      <w:pPr>
+        <w:pStyle w:val="ImageCaption"/>
+      </w:pPr>
+      <w:r>
+        <w:t xml:space="preserve">Рисунок А.1. Репозиторий проекта на GitHub</w:t>
+      </w:r>
+    </w:p>
+    <w:p>
+      <w:pPr>
+        <w:pStyle w:val="CaptionedFigure"/>
+      </w:pPr>
+      <w:r>
+        <w:drawing>
+          <wp:inline>
+            <wp:extent cx="4027170" cy="4194968"/>
+            <wp:effectExtent b="0" l="0" r="0" t="0"/>
+            <wp:docPr descr="Рисунок А.2. Успешный запуск CI/CD: задания test и build-and-push выполнены, deploy пропущен (запускается вручную)" title="" id="20" name="Picture"/>
+            <a:graphic>
+              <a:graphicData uri="http://schemas.openxmlformats.org/drawingml/2006/picture">
+                <pic:pic>
+                  <pic:nvPicPr>
+                    <pic:cNvPr descr="../docs/screenshots/02-actions-run.png" id="21" name="Picture"/>
+                    <pic:cNvPicPr>
+                      <a:picLocks noChangeArrowheads="1" noChangeAspect="1"/>
+                    </pic:cNvPicPr>
+                  </pic:nvPicPr>
+                  <pic:blipFill>
+                    <a:blip r:embed="rId19"/>
+                    <a:stretch>
+                      <a:fillRect/>
+                    </a:stretch>
+                  </pic:blipFill>
+                  <pic:spPr bwMode="auto">
+                    <a:xfrm>
+                      <a:off x="0" y="0"/>
+                      <a:ext cx="4027170" cy="4194968"/>
+                    </a:xfrm>
+                    <a:prstGeom prst="rect">
+                      <a:avLst/>
+                    </a:prstGeom>
+                    <a:noFill/>
+                    <a:ln w="9525">
+                      <a:noFill/>
+                      <a:headEnd/>
+                      <a:tailEnd/>
+                    </a:ln>
+                  </pic:spPr>
+                </pic:pic>
+              </a:graphicData>
+            </a:graphic>
+          </wp:inline>
+        </w:drawing>
+      </w:r>
+    </w:p>
+    <w:p>
+      <w:pPr>
+        <w:pStyle w:val="ImageCaption"/>
+      </w:pPr>
+      <w:r>
+        <w:t xml:space="preserve">Рисунок А.2. Успешный запуск CI/CD: задания test и build-and-push выполнены, deploy пропущен (запускается вручную)</w:t>
+      </w:r>
+    </w:p>
+    <w:p>
+      <w:pPr>
+        <w:pStyle w:val="CaptionedFigure"/>
+      </w:pPr>
+      <w:r>
+        <w:drawing>
+          <wp:inline>
+            <wp:extent cx="4027170" cy="4194968"/>
+            <wp:effectExtent b="0" l="0" r="0" t="0"/>
+            <wp:docPr descr="Рисунок А.3. Файл workflow с этапами test, build, push и deploy" title="" id="23" name="Picture"/>
+            <a:graphic>
+              <a:graphicData uri="http://schemas.openxmlformats.org/drawingml/2006/picture">
+                <pic:pic>
+                  <pic:nvPicPr>
+                    <pic:cNvPr descr="../docs/screenshots/08-workflow.png" id="24" name="Picture"/>
+                    <pic:cNvPicPr>
+                      <a:picLocks noChangeArrowheads="1" noChangeAspect="1"/>
+                    </pic:cNvPicPr>
+                  </pic:nvPicPr>
+                  <pic:blipFill>
+                    <a:blip r:embed="rId22"/>
+                    <a:stretch>
+                      <a:fillRect/>
+                    </a:stretch>
+                  </pic:blipFill>
+                  <pic:spPr bwMode="auto">
+                    <a:xfrm>
+                      <a:off x="0" y="0"/>
+                      <a:ext cx="4027170" cy="4194968"/>
+                    </a:xfrm>
+                    <a:prstGeom prst="rect">
+                      <a:avLst/>
+                    </a:prstGeom>
+                    <a:noFill/>
+                    <a:ln w="9525">
+                      <a:noFill/>
+                      <a:headEnd/>
+                      <a:tailEnd/>
+                    </a:ln>
+                  </pic:spPr>
+                </pic:pic>
+              </a:graphicData>
+            </a:graphic>
+          </wp:inline>
+        </w:drawing>
+      </w:r>
+    </w:p>
+    <w:p>
+      <w:pPr>
+        <w:pStyle w:val="ImageCaption"/>
+      </w:pPr>
+      <w:r>
+        <w:t xml:space="preserve">Рисунок А.3. Файл workflow с этапами test, build, push и deploy</w:t>
+      </w:r>
+    </w:p>
     <w:p>
       <w:pPr>
         <w:pStyle w:val="BodyText"/>
       </w:pPr>
       <w:r>
-        <w:t xml:space="preserve">Снимать после первого push: GitHub → Actions → запуск → задания; Docker Hub →</w:t>
-      </w:r>
-      <w:r>
-        <w:t xml:space="preserve"> </w:t>
-      </w:r>
-      <w:r>
-        <w:t xml:space="preserve">Tags; терминал для</w:t>
-      </w:r>
-      <w:r>
-        <w:t xml:space="preserve"> </w:t>
-      </w:r>
-      <w:r>
-        <w:rPr>
-          <w:rStyle w:val="VerbatimChar"/>
-        </w:rPr>
-        <w:t xml:space="preserve">kubectl</w:t>
-      </w:r>
-      <w:r>
-        <w:t xml:space="preserve"> </w:t>
-      </w:r>
-      <w:r>
-        <w:t xml:space="preserve">и</w:t>
-      </w:r>
-      <w:r>
-        <w:t xml:space="preserve"> </w:t>
-      </w:r>
-      <w:r>
-        <w:rPr>
-          <w:rStyle w:val="VerbatimChar"/>
-        </w:rPr>
-        <w:t xml:space="preserve">curl</w:t>
-      </w:r>
-      <w:r>
-        <w:t xml:space="preserve">.</w:t>
-      </w:r>
-    </w:p>
-    <w:bookmarkEnd w:id="16"/>
-    <w:bookmarkEnd w:id="17"/>
+        <w:t xml:space="preserve">Дополнительно после настройки секретов и кластера снять: теги образа на Docker</w:t>
+      </w:r>
+      <w:r>
+        <w:t xml:space="preserve"> </w:t>
+      </w:r>
+      <w:r>
+        <w:t xml:space="preserve">Hub (</w:t>
+      </w:r>
+      <w:r>
+        <w:rPr>
+          <w:rStyle w:val="VerbatimChar"/>
+        </w:rPr>
+        <w:t xml:space="preserve">04-dockerhub.png</w:t>
+      </w:r>
+      <w:r>
+        <w:t xml:space="preserve">),</w:t>
+      </w:r>
+      <w:r>
+        <w:t xml:space="preserve"> </w:t>
+      </w:r>
+      <w:r>
+        <w:rPr>
+          <w:rStyle w:val="VerbatimChar"/>
+        </w:rPr>
+        <w:t xml:space="preserve">kubectl get pods,svc -n iris</w:t>
+      </w:r>
+      <w:r>
+        <w:t xml:space="preserve"> </w:t>
+      </w:r>
+      <w:r>
+        <w:t xml:space="preserve">(</w:t>
+      </w:r>
+      <w:r>
+        <w:rPr>
+          <w:rStyle w:val="VerbatimChar"/>
+        </w:rPr>
+        <w:t xml:space="preserve">05-kubectl.png</w:t>
+      </w:r>
+      <w:r>
+        <w:t xml:space="preserve">), ответ</w:t>
+      </w:r>
+      <w:r>
+        <w:t xml:space="preserve"> </w:t>
+      </w:r>
+      <w:r>
+        <w:rPr>
+          <w:rStyle w:val="VerbatimChar"/>
+        </w:rPr>
+        <w:t xml:space="preserve">curl /predict</w:t>
+      </w:r>
+      <w:r>
+        <w:t xml:space="preserve"> </w:t>
+      </w:r>
+      <w:r>
+        <w:t xml:space="preserve">(</w:t>
+      </w:r>
+      <w:r>
+        <w:rPr>
+          <w:rStyle w:val="VerbatimChar"/>
+        </w:rPr>
+        <w:t xml:space="preserve">06-api.png</w:t>
+      </w:r>
+      <w:r>
+        <w:t xml:space="preserve">), красный запуск со сломанным тестом</w:t>
+      </w:r>
+      <w:r>
+        <w:t xml:space="preserve"> </w:t>
+      </w:r>
+      <w:r>
+        <w:t xml:space="preserve">(</w:t>
+      </w:r>
+      <w:r>
+        <w:rPr>
+          <w:rStyle w:val="VerbatimChar"/>
+        </w:rPr>
+        <w:t xml:space="preserve">07-failed-run.png</w:t>
+      </w:r>
+      <w:r>
+        <w:t xml:space="preserve">).</w:t>
+      </w:r>
+    </w:p>
+    <w:bookmarkEnd w:id="25"/>
+    <w:bookmarkEnd w:id="26"/>
     <w:sectPr>
       <w:footnotePr>
         <w:numRestart w:val="eachSect"/>

</xml_diff>

<commit_message>
Add Docker Hub tag screenshot and published image link
Co-Authored-By: Claude Code <noreply@anthropic.com>
</commit_message>
<xml_diff>
--- a/report/practical-report.docx
+++ b/report/practical-report.docx
@@ -2,7 +2,7 @@
 <file path=word/document.xml><?xml version="1.0" encoding="utf-8"?>
 <w:document xmlns:w="http://schemas.openxmlformats.org/wordprocessingml/2006/main" xmlns:m="http://schemas.openxmlformats.org/officeDocument/2006/math" xmlns:r="http://schemas.openxmlformats.org/officeDocument/2006/relationships" xmlns:o="urn:schemas-microsoft-com:office:office" xmlns:v="urn:schemas-microsoft-com:vml" xmlns:w10="urn:schemas-microsoft-com:office:word" xmlns:a="http://schemas.openxmlformats.org/drawingml/2006/main" xmlns:pic="http://schemas.openxmlformats.org/drawingml/2006/picture" xmlns:wp="http://schemas.openxmlformats.org/drawingml/2006/wordprocessingDrawing">
   <w:body>
-    <w:bookmarkStart w:id="26" w:name="X33245fbb24b90d793328635e71973c7629692ff"/>
+    <w:bookmarkStart w:id="29" w:name="X33245fbb24b90d793328635e71973c7629692ff"/>
     <w:p>
       <w:pPr>
         <w:pStyle w:val="Heading1"/>
@@ -1134,7 +1134,7 @@
       </w:r>
     </w:p>
     <w:bookmarkEnd w:id="15"/>
-    <w:bookmarkStart w:id="25" w:name="приложение-а.-скриншоты"/>
+    <w:bookmarkStart w:id="28" w:name="приложение-а.-скриншоты"/>
     <w:p>
       <w:pPr>
         <w:pStyle w:val="Heading2"/>
@@ -1205,7 +1205,7 @@
       <w:r>
         <w:drawing>
           <wp:inline>
-            <wp:extent cx="4027170" cy="4194968"/>
+            <wp:extent cx="4027170" cy="3355975"/>
             <wp:effectExtent b="0" l="0" r="0" t="0"/>
             <wp:docPr descr="Рисунок А.2. Успешный запуск CI/CD: задания test и build-and-push выполнены, deploy пропущен (запускается вручную)" title="" id="20" name="Picture"/>
             <a:graphic>
@@ -1226,7 +1226,7 @@
                   <pic:spPr bwMode="auto">
                     <a:xfrm>
                       <a:off x="0" y="0"/>
-                      <a:ext cx="4027170" cy="4194968"/>
+                      <a:ext cx="4027170" cy="3355975"/>
                     </a:xfrm>
                     <a:prstGeom prst="rect">
                       <a:avLst/>
@@ -1310,25 +1310,65 @@
     </w:p>
     <w:p>
       <w:pPr>
+        <w:pStyle w:val="CaptionedFigure"/>
+      </w:pPr>
+      <w:r>
+        <w:drawing>
+          <wp:inline>
+            <wp:extent cx="4027170" cy="3355975"/>
+            <wp:effectExtent b="0" l="0" r="0" t="0"/>
+            <wp:docPr descr="Рисунок А.4. Образ опубликован в Docker Hub: теги по хешу коммита и latest" title="" id="26" name="Picture"/>
+            <a:graphic>
+              <a:graphicData uri="http://schemas.openxmlformats.org/drawingml/2006/picture">
+                <pic:pic>
+                  <pic:nvPicPr>
+                    <pic:cNvPr descr="../docs/screenshots/04-dockerhub.png" id="27" name="Picture"/>
+                    <pic:cNvPicPr>
+                      <a:picLocks noChangeArrowheads="1" noChangeAspect="1"/>
+                    </pic:cNvPicPr>
+                  </pic:nvPicPr>
+                  <pic:blipFill>
+                    <a:blip r:embed="rId25"/>
+                    <a:stretch>
+                      <a:fillRect/>
+                    </a:stretch>
+                  </pic:blipFill>
+                  <pic:spPr bwMode="auto">
+                    <a:xfrm>
+                      <a:off x="0" y="0"/>
+                      <a:ext cx="4027170" cy="3355975"/>
+                    </a:xfrm>
+                    <a:prstGeom prst="rect">
+                      <a:avLst/>
+                    </a:prstGeom>
+                    <a:noFill/>
+                    <a:ln w="9525">
+                      <a:noFill/>
+                      <a:headEnd/>
+                      <a:tailEnd/>
+                    </a:ln>
+                  </pic:spPr>
+                </pic:pic>
+              </a:graphicData>
+            </a:graphic>
+          </wp:inline>
+        </w:drawing>
+      </w:r>
+    </w:p>
+    <w:p>
+      <w:pPr>
+        <w:pStyle w:val="ImageCaption"/>
+      </w:pPr>
+      <w:r>
+        <w:t xml:space="preserve">Рисунок А.4. Образ опубликован в Docker Hub: теги по хешу коммита и latest</w:t>
+      </w:r>
+    </w:p>
+    <w:p>
+      <w:pPr>
         <w:pStyle w:val="BodyText"/>
       </w:pPr>
       <w:r>
-        <w:t xml:space="preserve">Дополнительно после настройки секретов и кластера снять: теги образа на Docker</w:t>
-      </w:r>
-      <w:r>
-        <w:t xml:space="preserve"> </w:t>
-      </w:r>
-      <w:r>
-        <w:t xml:space="preserve">Hub (</w:t>
-      </w:r>
-      <w:r>
-        <w:rPr>
-          <w:rStyle w:val="VerbatimChar"/>
-        </w:rPr>
-        <w:t xml:space="preserve">04-dockerhub.png</w:t>
-      </w:r>
-      <w:r>
-        <w:t xml:space="preserve">),</w:t>
+        <w:t xml:space="preserve">Дополнительно после подъёма кластера снять:</w:t>
       </w:r>
       <w:r>
         <w:t xml:space="preserve"> </w:t>
@@ -1376,13 +1416,13 @@
         <w:t xml:space="preserve">06-api.png</w:t>
       </w:r>
       <w:r>
-        <w:t xml:space="preserve">), красный запуск со сломанным тестом</w:t>
-      </w:r>
-      <w:r>
-        <w:t xml:space="preserve"> </w:t>
-      </w:r>
-      <w:r>
-        <w:t xml:space="preserve">(</w:t>
+        <w:t xml:space="preserve">), красный запуск со</w:t>
+      </w:r>
+      <w:r>
+        <w:t xml:space="preserve"> </w:t>
+      </w:r>
+      <w:r>
+        <w:t xml:space="preserve">сломанным тестом (</w:t>
       </w:r>
       <w:r>
         <w:rPr>
@@ -1394,8 +1434,8 @@
         <w:t xml:space="preserve">).</w:t>
       </w:r>
     </w:p>
-    <w:bookmarkEnd w:id="25"/>
-    <w:bookmarkEnd w:id="26"/>
+    <w:bookmarkEnd w:id="28"/>
+    <w:bookmarkEnd w:id="29"/>
     <w:sectPr>
       <w:footnotePr>
         <w:numRestart w:val="eachSect"/>

</xml_diff>

<commit_message>
Record verified Minikube deployment in practical report
Co-Authored-By: Claude Code <noreply@anthropic.com>
</commit_message>
<xml_diff>
--- a/report/practical-report.docx
+++ b/report/practical-report.docx
@@ -899,6 +899,60 @@
       </w:r>
       <w:r>
         <w:t xml:space="preserve">публикует сервис на NodePort 30080.</w:t>
+      </w:r>
+      <w:r>
+        <w:t xml:space="preserve"> </w:t>
+      </w:r>
+      <w:r>
+        <w:t xml:space="preserve">Развёртывание проверено в Minikube: 2/2 пода</w:t>
+      </w:r>
+      <w:r>
+        <w:t xml:space="preserve"> </w:t>
+      </w:r>
+      <w:r>
+        <w:rPr>
+          <w:rStyle w:val="VerbatimChar"/>
+        </w:rPr>
+        <w:t xml:space="preserve">Running</w:t>
+      </w:r>
+      <w:r>
+        <w:t xml:space="preserve">,</w:t>
+      </w:r>
+      <w:r>
+        <w:t xml:space="preserve"> </w:t>
+      </w:r>
+      <w:r>
+        <w:rPr>
+          <w:rStyle w:val="VerbatimChar"/>
+        </w:rPr>
+        <w:t xml:space="preserve">/predict</w:t>
+      </w:r>
+      <w:r>
+        <w:t xml:space="preserve"> </w:t>
+      </w:r>
+      <w:r>
+        <w:t xml:space="preserve">через Service</w:t>
+      </w:r>
+      <w:r>
+        <w:t xml:space="preserve"> </w:t>
+      </w:r>
+      <w:r>
+        <w:t xml:space="preserve">вернул</w:t>
+      </w:r>
+      <w:r>
+        <w:t xml:space="preserve"> </w:t>
+      </w:r>
+      <w:r>
+        <w:rPr>
+          <w:rStyle w:val="VerbatimChar"/>
+        </w:rPr>
+        <w:t xml:space="preserve">versicolor</w:t>
+      </w:r>
+      <w:r>
+        <w:t xml:space="preserve"> </w:t>
+      </w:r>
+      <w:r>
+        <w:t xml:space="preserve">с уверенностью 0.98.</w:t>
       </w:r>
     </w:p>
     <w:p>

</xml_diff>

<commit_message>
Force black text in reports and add published image link
Co-Authored-By: Claude Code <noreply@anthropic.com>
</commit_message>
<xml_diff>
--- a/report/practical-report.docx
+++ b/report/practical-report.docx
@@ -132,120 +132,18 @@
       </w:pPr>
       <w:r>
         <w:rPr>
-          <w:rStyle w:val="ExtensionTok"/>
-        </w:rPr>
-        <w:t xml:space="preserve">python3</w:t>
-      </w:r>
-      <w:r>
-        <w:rPr>
-          <w:rStyle w:val="NormalTok"/>
-        </w:rPr>
-        <w:t xml:space="preserve"> </w:t>
-      </w:r>
-      <w:r>
-        <w:rPr>
-          <w:rStyle w:val="AttributeTok"/>
-        </w:rPr>
-        <w:t xml:space="preserve">-m</w:t>
-      </w:r>
-      <w:r>
-        <w:rPr>
-          <w:rStyle w:val="NormalTok"/>
-        </w:rPr>
-        <w:t xml:space="preserve"> venv .venv </w:t>
-      </w:r>
-      <w:r>
-        <w:rPr>
-          <w:rStyle w:val="KeywordTok"/>
-        </w:rPr>
-        <w:t xml:space="preserve">&amp;&amp;</w:t>
-      </w:r>
-      <w:r>
-        <w:rPr>
-          <w:rStyle w:val="NormalTok"/>
-        </w:rPr>
-        <w:t xml:space="preserve"> </w:t>
-      </w:r>
-      <w:r>
-        <w:rPr>
-          <w:rStyle w:val="BuiltInTok"/>
-        </w:rPr>
-        <w:t xml:space="preserve">source</w:t>
-      </w:r>
-      <w:r>
-        <w:rPr>
-          <w:rStyle w:val="NormalTok"/>
-        </w:rPr>
-        <w:t xml:space="preserve"> .venv/bin/activate</w:t>
+          <w:rStyle w:val="VerbatimChar"/>
+        </w:rPr>
+        <w:t xml:space="preserve">python3 -m venv .venv &amp;&amp; source .venv/bin/activate</w:t>
       </w:r>
       <w:r>
         <w:br/>
       </w:r>
       <w:r>
         <w:rPr>
-          <w:rStyle w:val="ExtensionTok"/>
-        </w:rPr>
-        <w:t xml:space="preserve">pip</w:t>
-      </w:r>
-      <w:r>
-        <w:rPr>
-          <w:rStyle w:val="NormalTok"/>
-        </w:rPr>
-        <w:t xml:space="preserve"> install </w:t>
-      </w:r>
-      <w:r>
-        <w:rPr>
-          <w:rStyle w:val="AttributeTok"/>
-        </w:rPr>
-        <w:t xml:space="preserve">-r</w:t>
-      </w:r>
-      <w:r>
-        <w:rPr>
-          <w:rStyle w:val="NormalTok"/>
-        </w:rPr>
-        <w:t xml:space="preserve"> requirements-dev.txt </w:t>
-      </w:r>
-      <w:r>
-        <w:rPr>
-          <w:rStyle w:val="KeywordTok"/>
-        </w:rPr>
-        <w:t xml:space="preserve">&amp;&amp;</w:t>
-      </w:r>
-      <w:r>
-        <w:rPr>
-          <w:rStyle w:val="NormalTok"/>
-        </w:rPr>
-        <w:t xml:space="preserve"> </w:t>
-      </w:r>
-      <w:r>
-        <w:rPr>
-          <w:rStyle w:val="ExtensionTok"/>
-        </w:rPr>
-        <w:t xml:space="preserve">python</w:t>
-      </w:r>
-      <w:r>
-        <w:rPr>
-          <w:rStyle w:val="NormalTok"/>
-        </w:rPr>
-        <w:t xml:space="preserve"> </w:t>
-      </w:r>
-      <w:r>
-        <w:rPr>
-          <w:rStyle w:val="AttributeTok"/>
-        </w:rPr>
-        <w:t xml:space="preserve">-m</w:t>
-      </w:r>
-      <w:r>
-        <w:rPr>
-          <w:rStyle w:val="NormalTok"/>
-        </w:rPr>
-        <w:t xml:space="preserve"> pytest </w:t>
-      </w:r>
-      <w:r>
-        <w:rPr>
-          <w:rStyle w:val="AttributeTok"/>
-        </w:rPr>
-        <w:t xml:space="preserve">-v</w:t>
+          <w:rStyle w:val="VerbatimChar"/>
+        </w:rPr>
+        <w:t xml:space="preserve">pip install -r requirements-dev.txt &amp;&amp; python -m pytest -v</w:t>
       </w:r>
     </w:p>
     <w:p>
@@ -393,66 +291,18 @@
       </w:pPr>
       <w:r>
         <w:rPr>
-          <w:rStyle w:val="ExtensionTok"/>
-        </w:rPr>
-        <w:t xml:space="preserve">docker</w:t>
-      </w:r>
-      <w:r>
-        <w:rPr>
-          <w:rStyle w:val="NormalTok"/>
-        </w:rPr>
-        <w:t xml:space="preserve"> build </w:t>
-      </w:r>
-      <w:r>
-        <w:rPr>
-          <w:rStyle w:val="AttributeTok"/>
-        </w:rPr>
-        <w:t xml:space="preserve">-t</w:t>
-      </w:r>
-      <w:r>
-        <w:rPr>
-          <w:rStyle w:val="NormalTok"/>
-        </w:rPr>
-        <w:t xml:space="preserve"> iris-classifier:local .</w:t>
+          <w:rStyle w:val="VerbatimChar"/>
+        </w:rPr>
+        <w:t xml:space="preserve">docker build -t iris-classifier:local .</w:t>
       </w:r>
       <w:r>
         <w:br/>
       </w:r>
       <w:r>
         <w:rPr>
-          <w:rStyle w:val="ExtensionTok"/>
-        </w:rPr>
-        <w:t xml:space="preserve">docker</w:t>
-      </w:r>
-      <w:r>
-        <w:rPr>
-          <w:rStyle w:val="NormalTok"/>
-        </w:rPr>
-        <w:t xml:space="preserve"> run </w:t>
-      </w:r>
-      <w:r>
-        <w:rPr>
-          <w:rStyle w:val="AttributeTok"/>
-        </w:rPr>
-        <w:t xml:space="preserve">--rm</w:t>
-      </w:r>
-      <w:r>
-        <w:rPr>
-          <w:rStyle w:val="NormalTok"/>
-        </w:rPr>
-        <w:t xml:space="preserve"> </w:t>
-      </w:r>
-      <w:r>
-        <w:rPr>
-          <w:rStyle w:val="AttributeTok"/>
-        </w:rPr>
-        <w:t xml:space="preserve">-p</w:t>
-      </w:r>
-      <w:r>
-        <w:rPr>
-          <w:rStyle w:val="NormalTok"/>
-        </w:rPr>
-        <w:t xml:space="preserve"> 8000:8000 iris-classifier:local</w:t>
+          <w:rStyle w:val="VerbatimChar"/>
+        </w:rPr>
+        <w:t xml:space="preserve">docker run --rm -p 8000:8000 iris-classifier:local</w:t>
       </w:r>
     </w:p>
     <w:p>
@@ -520,7 +370,13 @@
         <w:t xml:space="preserve"> </w:t>
       </w:r>
       <w:r>
-        <w:t xml:space="preserve">— точность 0.9; размер образа 123 МБ.</w:t>
+        <w:t xml:space="preserve">— точность 0.9; размер образа 123 МБ. Образ опубликован:</w:t>
+      </w:r>
+      <w:r>
+        <w:t xml:space="preserve"> </w:t>
+      </w:r>
+      <w:r>
+        <w:t xml:space="preserve">https://hub.docker.com/r/gybraty/iris-classifier.</w:t>
       </w:r>
     </w:p>
     <w:bookmarkEnd w:id="11"/>
@@ -961,66 +817,18 @@
       </w:pPr>
       <w:r>
         <w:rPr>
-          <w:rStyle w:val="ExtensionTok"/>
-        </w:rPr>
-        <w:t xml:space="preserve">minikube</w:t>
-      </w:r>
-      <w:r>
-        <w:rPr>
-          <w:rStyle w:val="NormalTok"/>
-        </w:rPr>
-        <w:t xml:space="preserve"> start </w:t>
-      </w:r>
-      <w:r>
-        <w:rPr>
-          <w:rStyle w:val="KeywordTok"/>
-        </w:rPr>
-        <w:t xml:space="preserve">&amp;&amp;</w:t>
-      </w:r>
-      <w:r>
-        <w:rPr>
-          <w:rStyle w:val="NormalTok"/>
-        </w:rPr>
-        <w:t xml:space="preserve"> </w:t>
-      </w:r>
-      <w:r>
-        <w:rPr>
-          <w:rStyle w:val="ExtensionTok"/>
-        </w:rPr>
-        <w:t xml:space="preserve">kubectl</w:t>
-      </w:r>
-      <w:r>
-        <w:rPr>
-          <w:rStyle w:val="NormalTok"/>
-        </w:rPr>
-        <w:t xml:space="preserve"> apply </w:t>
-      </w:r>
-      <w:r>
-        <w:rPr>
-          <w:rStyle w:val="AttributeTok"/>
-        </w:rPr>
-        <w:t xml:space="preserve">-f</w:t>
-      </w:r>
-      <w:r>
-        <w:rPr>
-          <w:rStyle w:val="NormalTok"/>
-        </w:rPr>
-        <w:t xml:space="preserve"> k8s/</w:t>
+          <w:rStyle w:val="VerbatimChar"/>
+        </w:rPr>
+        <w:t xml:space="preserve">minikube start &amp;&amp; kubectl apply -f k8s/</w:t>
       </w:r>
       <w:r>
         <w:br/>
       </w:r>
       <w:r>
         <w:rPr>
-          <w:rStyle w:val="ExtensionTok"/>
-        </w:rPr>
-        <w:t xml:space="preserve">minikube</w:t>
-      </w:r>
-      <w:r>
-        <w:rPr>
-          <w:rStyle w:val="NormalTok"/>
-        </w:rPr>
-        <w:t xml:space="preserve"> image load iris-classifier:local</w:t>
+          <w:rStyle w:val="VerbatimChar"/>
+        </w:rPr>
+        <w:t xml:space="preserve">minikube image load iris-classifier:local</w:t>
       </w:r>
     </w:p>
     <w:bookmarkEnd w:id="13"/>
@@ -1809,6 +1617,7 @@
     </w:pPr>
     <w:rPr>
       <w:rFonts w:asciiTheme="majorHAnsi" w:cstheme="majorBidi" w:eastAsiaTheme="majorEastAsia" w:hAnsiTheme="majorHAnsi"/>
+      <w:color w:val="000000"/>
       <w:sz w:val="56"/>
       <w:szCs w:val="56"/>
     </w:rPr>
@@ -1821,6 +1630,7 @@
     <w:rsid w:val="00A10FD9"/>
     <w:rPr>
       <w:rFonts w:asciiTheme="majorHAnsi" w:cstheme="majorBidi" w:eastAsiaTheme="majorEastAsia" w:hAnsiTheme="majorHAnsi"/>
+      <w:color w:val="000000"/>
       <w:sz w:val="56"/>
       <w:szCs w:val="56"/>
     </w:rPr>
@@ -1840,6 +1650,7 @@
     </w:pPr>
     <w:rPr>
       <w:rFonts w:cstheme="majorBidi" w:eastAsiaTheme="majorEastAsia"/>
+      <w:color w:val="000000"/>
       <w:spacing w:val="15"/>
       <w:sz w:val="28"/>
       <w:szCs w:val="28"/>
@@ -1853,7 +1664,7 @@
     <w:rsid w:val="00A10FD9"/>
     <w:rPr>
       <w:rFonts w:cstheme="majorBidi" w:eastAsiaTheme="majorEastAsia"/>
-      <w:color w:themeColor="text1" w:themeTint="A6" w:val="595959"/>
+      <w:color w:val="000000"/>
       <w:spacing w:val="15"/>
       <w:sz w:val="28"/>
       <w:szCs w:val="28"/>
@@ -1869,6 +1680,7 @@
       <w:keepLines/>
     </w:pPr>
     <w:rPr>
+      <w:color w:val="000000"/>
       <w:sz w:val="24"/>
       <w:szCs w:val="24"/>
     </w:rPr>
@@ -1883,6 +1695,7 @@
       <w:keepLines/>
     </w:pPr>
     <w:rPr>
+      <w:color w:val="000000"/>
       <w:sz w:val="24"/>
       <w:szCs w:val="24"/>
     </w:rPr>
@@ -1900,6 +1713,7 @@
     </w:pPr>
     <w:rPr>
       <w:b/>
+      <w:color w:val="000000"/>
       <w:sz w:val="20"/>
       <w:szCs w:val="20"/>
     </w:rPr>
@@ -1915,6 +1729,7 @@
       <w:spacing w:after="300" w:before="100"/>
     </w:pPr>
     <w:rPr>
+      <w:color w:val="000000"/>
       <w:sz w:val="20"/>
       <w:szCs w:val="20"/>
     </w:rPr>
@@ -1925,7 +1740,9 @@
     <w:next w:val="Bibliography"/>
     <w:qFormat/>
     <w:pPr/>
-    <w:rPr/>
+    <w:rPr>
+      <w:color w:val="000000"/>
+    </w:rPr>
   </w:style>
   <w:style w:styleId="Heading1" w:type="paragraph">
     <w:name w:val="heading 1"/>
@@ -2017,7 +1834,7 @@
       <w:rFonts w:cstheme="majorBidi" w:eastAsiaTheme="majorEastAsia"/>
       <w:i/>
       <w:iCs/>
-      <w:color w:themeColor="accent1" w:themeShade="BF" w:val="0F4761"/>
+      <w:color w:val="000000"/>
     </w:rPr>
   </w:style>
   <w:style w:styleId="Heading5" w:type="paragraph">
@@ -2038,7 +1855,7 @@
     </w:pPr>
     <w:rPr>
       <w:rFonts w:cstheme="majorBidi" w:eastAsiaTheme="majorEastAsia"/>
-      <w:color w:themeColor="accent1" w:themeShade="BF" w:val="0F4761"/>
+      <w:color w:val="000000"/>
     </w:rPr>
   </w:style>
   <w:style w:styleId="Heading6" w:type="paragraph">
@@ -2061,7 +1878,7 @@
       <w:rFonts w:cstheme="majorBidi" w:eastAsiaTheme="majorEastAsia"/>
       <w:i/>
       <w:iCs/>
-      <w:color w:themeColor="text1" w:themeTint="A6" w:val="595959"/>
+      <w:color w:val="000000"/>
     </w:rPr>
   </w:style>
   <w:style w:styleId="Heading7" w:type="paragraph">
@@ -2082,7 +1899,7 @@
     </w:pPr>
     <w:rPr>
       <w:rFonts w:cstheme="majorBidi" w:eastAsiaTheme="majorEastAsia"/>
-      <w:color w:themeColor="text1" w:themeTint="A6" w:val="595959"/>
+      <w:color w:val="000000"/>
     </w:rPr>
   </w:style>
   <w:style w:styleId="Heading8" w:type="paragraph">
@@ -2105,7 +1922,7 @@
       <w:rFonts w:cstheme="majorBidi" w:eastAsiaTheme="majorEastAsia"/>
       <w:i/>
       <w:iCs/>
-      <w:color w:themeColor="text1" w:themeTint="D8" w:val="272727"/>
+      <w:color w:val="000000"/>
     </w:rPr>
   </w:style>
   <w:style w:styleId="Heading9" w:type="paragraph">
@@ -2126,7 +1943,7 @@
     </w:pPr>
     <w:rPr>
       <w:rFonts w:cstheme="majorBidi" w:eastAsiaTheme="majorEastAsia"/>
-      <w:color w:themeColor="text1" w:themeTint="D8" w:val="272727"/>
+      <w:color w:val="000000"/>
     </w:rPr>
   </w:style>
   <w:style w:customStyle="1" w:styleId="Heading1Char" w:type="character">
@@ -2137,7 +1954,7 @@
     <w:rsid w:val="00A10FD9"/>
     <w:rPr>
       <w:rFonts w:asciiTheme="majorHAnsi" w:cstheme="majorBidi" w:eastAsiaTheme="majorEastAsia" w:hAnsiTheme="majorHAnsi"/>
-      <w:color w:themeColor="accent1" w:themeShade="BF" w:val="0F4761"/>
+      <w:color w:val="000000"/>
       <w:sz w:val="40"/>
       <w:szCs w:val="40"/>
     </w:rPr>
@@ -2151,7 +1968,7 @@
     <w:rsid w:val="00A10FD9"/>
     <w:rPr>
       <w:rFonts w:asciiTheme="majorHAnsi" w:cstheme="majorBidi" w:eastAsiaTheme="majorEastAsia" w:hAnsiTheme="majorHAnsi"/>
-      <w:color w:themeColor="accent1" w:themeShade="BF" w:val="0F4761"/>
+      <w:color w:val="000000"/>
       <w:sz w:val="32"/>
       <w:szCs w:val="32"/>
     </w:rPr>
@@ -2165,7 +1982,7 @@
     <w:rsid w:val="00A10FD9"/>
     <w:rPr>
       <w:rFonts w:cstheme="majorBidi" w:eastAsiaTheme="majorEastAsia"/>
-      <w:color w:themeColor="accent1" w:themeShade="BF" w:val="0F4761"/>
+      <w:color w:val="000000"/>
       <w:sz w:val="28"/>
       <w:szCs w:val="28"/>
     </w:rPr>
@@ -2181,7 +1998,7 @@
       <w:rFonts w:cstheme="majorBidi" w:eastAsiaTheme="majorEastAsia"/>
       <w:i/>
       <w:iCs/>
-      <w:color w:themeColor="accent1" w:themeShade="BF" w:val="0F4761"/>
+      <w:color w:val="000000"/>
     </w:rPr>
   </w:style>
   <w:style w:customStyle="1" w:styleId="Heading5Char" w:type="character">
@@ -2193,7 +2010,7 @@
     <w:rsid w:val="00A10FD9"/>
     <w:rPr>
       <w:rFonts w:cstheme="majorBidi" w:eastAsiaTheme="majorEastAsia"/>
-      <w:color w:themeColor="accent1" w:themeShade="BF" w:val="0F4761"/>
+      <w:color w:val="000000"/>
     </w:rPr>
   </w:style>
   <w:style w:customStyle="1" w:styleId="Heading6Char" w:type="character">
@@ -2207,7 +2024,7 @@
       <w:rFonts w:cstheme="majorBidi" w:eastAsiaTheme="majorEastAsia"/>
       <w:i/>
       <w:iCs/>
-      <w:color w:themeColor="text1" w:themeTint="A6" w:val="595959"/>
+      <w:color w:val="000000"/>
     </w:rPr>
   </w:style>
   <w:style w:customStyle="1" w:styleId="Heading7Char" w:type="character">
@@ -2219,7 +2036,7 @@
     <w:rsid w:val="00A10FD9"/>
     <w:rPr>
       <w:rFonts w:cstheme="majorBidi" w:eastAsiaTheme="majorEastAsia"/>
-      <w:color w:themeColor="text1" w:themeTint="A6" w:val="595959"/>
+      <w:color w:val="000000"/>
     </w:rPr>
   </w:style>
   <w:style w:customStyle="1" w:styleId="Heading8Char" w:type="character">
@@ -2233,7 +2050,7 @@
       <w:rFonts w:cstheme="majorBidi" w:eastAsiaTheme="majorEastAsia"/>
       <w:i/>
       <w:iCs/>
-      <w:color w:themeColor="text1" w:themeTint="D8" w:val="272727"/>
+      <w:color w:val="000000"/>
     </w:rPr>
   </w:style>
   <w:style w:customStyle="1" w:styleId="Heading9Char" w:type="character">
@@ -2245,7 +2062,7 @@
     <w:rsid w:val="00A10FD9"/>
     <w:rPr>
       <w:rFonts w:cstheme="majorBidi" w:eastAsiaTheme="majorEastAsia"/>
-      <w:color w:themeColor="text1" w:themeTint="D8" w:val="272727"/>
+      <w:color w:val="000000"/>
     </w:rPr>
   </w:style>
   <w:style w:styleId="BlockText" w:type="paragraph">
@@ -2272,6 +2089,9 @@
     <w:uiPriority w:val="9"/>
     <w:unhideWhenUsed/>
     <w:qFormat/>
+    <w:rPr>
+      <w:color w:val="000000"/>
+    </w:rPr>
   </w:style>
   <w:style w:styleId="FootnoteBlockText" w:type="paragraph">
     <w:name w:val="Footnote Block Text"/>
@@ -2284,11 +2104,17 @@
       <w:spacing w:after="100" w:before="100"/>
       <w:ind w:firstLine="0" w:left="480" w:right="480"/>
     </w:pPr>
+    <w:rPr>
+      <w:color w:val="000000"/>
+    </w:rPr>
   </w:style>
   <w:style w:default="1" w:styleId="DefaultParagraphFont" w:type="character">
     <w:name w:val="Default Paragraph Font"/>
     <w:semiHidden/>
     <w:unhideWhenUsed/>
+    <w:rPr>
+      <w:color w:val="000000"/>
+    </w:rPr>
   </w:style>
   <w:style w:default="1" w:styleId="Table" w:type="table">
     <w:name w:val="Table"/>
@@ -2296,6 +2122,9 @@
     <w:semiHidden/>
     <w:unhideWhenUsed/>
     <w:qFormat/>
+    <w:rPr>
+      <w:color w:val="000000"/>
+    </w:rPr>
     <w:tblPr>
       <w:tblInd w:type="dxa" w:w="0"/>
       <w:tblCellMar>
@@ -2325,11 +2154,15 @@
     </w:pPr>
     <w:rPr>
       <w:b/>
+      <w:color w:val="000000"/>
     </w:rPr>
   </w:style>
   <w:style w:customStyle="1" w:styleId="Definition" w:type="paragraph">
     <w:name w:val="Definition"/>
     <w:basedOn w:val="Normal"/>
+    <w:rPr>
+      <w:color w:val="000000"/>
+    </w:rPr>
   </w:style>
   <w:style w:styleId="Caption" w:type="paragraph">
     <w:name w:val="Caption"/>
@@ -2340,6 +2173,7 @@
     </w:pPr>
     <w:rPr>
       <w:i/>
+      <w:color w:val="000000"/>
     </w:rPr>
   </w:style>
   <w:style w:customStyle="1" w:styleId="TableCaption" w:type="paragraph">
@@ -2348,14 +2182,23 @@
     <w:pPr>
       <w:keepNext/>
     </w:pPr>
+    <w:rPr>
+      <w:color w:val="000000"/>
+    </w:rPr>
   </w:style>
   <w:style w:customStyle="1" w:styleId="ImageCaption" w:type="paragraph">
     <w:name w:val="Image Caption"/>
     <w:basedOn w:val="Caption"/>
+    <w:rPr>
+      <w:color w:val="000000"/>
+    </w:rPr>
   </w:style>
   <w:style w:customStyle="1" w:styleId="Figure" w:type="paragraph">
     <w:name w:val="Figure"/>
     <w:basedOn w:val="Normal"/>
+    <w:rPr>
+      <w:color w:val="000000"/>
+    </w:rPr>
   </w:style>
   <w:style w:customStyle="1" w:styleId="CaptionedFigure" w:type="paragraph">
     <w:name w:val="Captioned Figure"/>
@@ -2363,28 +2206,39 @@
     <w:pPr>
       <w:keepNext/>
     </w:pPr>
+    <w:rPr>
+      <w:color w:val="000000"/>
+    </w:rPr>
   </w:style>
   <w:style w:customStyle="1" w:styleId="BodyTextChar" w:type="character">
     <w:name w:val="Body Text Char"/>
     <w:basedOn w:val="DefaultParagraphFont"/>
     <w:link w:val="BodyText"/>
+    <w:rPr>
+      <w:color w:val="000000"/>
+    </w:rPr>
   </w:style>
   <w:style w:customStyle="1" w:styleId="VerbatimChar" w:type="character">
     <w:name w:val="Verbatim Char"/>
     <w:basedOn w:val="BodyTextChar"/>
     <w:rPr>
       <w:rFonts w:ascii="Consolas" w:hAnsi="Consolas"/>
+      <w:color w:val="000000"/>
       <w:sz w:val="22"/>
     </w:rPr>
   </w:style>
   <w:style w:customStyle="1" w:styleId="SectionNumber" w:type="character">
     <w:name w:val="Section Number"/>
     <w:basedOn w:val="BodyTextChar"/>
+    <w:rPr>
+      <w:color w:val="000000"/>
+    </w:rPr>
   </w:style>
   <w:style w:styleId="FootnoteReference" w:type="character">
     <w:name w:val="Footnote Reference"/>
     <w:basedOn w:val="BodyTextChar"/>
     <w:rPr>
+      <w:color w:val="000000"/>
       <w:vertAlign w:val="superscript"/>
     </w:rPr>
   </w:style>
@@ -2392,7 +2246,7 @@
     <w:name w:val="Hyperlink"/>
     <w:basedOn w:val="BodyTextChar"/>
     <w:rPr>
-      <w:color w:themeColor="accent1" w:val="4F81BD"/>
+      <w:color w:val="000000"/>
     </w:rPr>
   </w:style>
   <w:style w:styleId="TOCHeading" w:type="paragraph">
@@ -2410,242 +2264,8 @@
       <w:rFonts w:asciiTheme="majorHAnsi" w:cstheme="majorBidi" w:eastAsiaTheme="majorEastAsia" w:hAnsiTheme="majorHAnsi"/>
       <w:b w:val="0"/>
       <w:bCs w:val="0"/>
-      <w:color w:themeColor="accent1" w:themeShade="BF" w:val="365F91"/>
-    </w:rPr>
-  </w:style>
-  <w:style w:type="paragraph" w:customStyle="1" w:styleId="SourceCode">
-    <w:name w:val="Source Code"/>
-    <w:basedOn w:val="Normal"/>
-    <w:link w:val="VerbatimChar"/>
-    <w:pPr>
-      <w:wordWrap w:val="off"/>
-    </w:pPr>
-  </w:style>
-  <w:style w:type="character" w:customStyle="1" w:styleId="KeywordTok">
-    <w:name w:val="KeywordTok"/>
-    <w:basedOn w:val="VerbatimChar"/>
-    <w:rPr>
-      <w:b/>
-      <w:color w:val="007020"/>
-    </w:rPr>
-  </w:style>
-  <w:style w:type="character" w:customStyle="1" w:styleId="DataTypeTok">
-    <w:name w:val="DataTypeTok"/>
-    <w:basedOn w:val="VerbatimChar"/>
-    <w:rPr>
-      <w:color w:val="902000"/>
-    </w:rPr>
-  </w:style>
-  <w:style w:type="character" w:customStyle="1" w:styleId="DecValTok">
-    <w:name w:val="DecValTok"/>
-    <w:basedOn w:val="VerbatimChar"/>
-    <w:rPr>
-      <w:color w:val="40a070"/>
-    </w:rPr>
-  </w:style>
-  <w:style w:type="character" w:customStyle="1" w:styleId="BaseNTok">
-    <w:name w:val="BaseNTok"/>
-    <w:basedOn w:val="VerbatimChar"/>
-    <w:rPr>
-      <w:color w:val="40a070"/>
-    </w:rPr>
-  </w:style>
-  <w:style w:type="character" w:customStyle="1" w:styleId="FloatTok">
-    <w:name w:val="FloatTok"/>
-    <w:basedOn w:val="VerbatimChar"/>
-    <w:rPr>
-      <w:color w:val="40a070"/>
-    </w:rPr>
-  </w:style>
-  <w:style w:type="character" w:customStyle="1" w:styleId="ConstantTok">
-    <w:name w:val="ConstantTok"/>
-    <w:basedOn w:val="VerbatimChar"/>
-    <w:rPr>
-      <w:color w:val="880000"/>
-    </w:rPr>
-  </w:style>
-  <w:style w:type="character" w:customStyle="1" w:styleId="CharTok">
-    <w:name w:val="CharTok"/>
-    <w:basedOn w:val="VerbatimChar"/>
-    <w:rPr>
-      <w:color w:val="4070a0"/>
-    </w:rPr>
-  </w:style>
-  <w:style w:type="character" w:customStyle="1" w:styleId="SpecialCharTok">
-    <w:name w:val="SpecialCharTok"/>
-    <w:basedOn w:val="VerbatimChar"/>
-    <w:rPr>
-      <w:color w:val="4070a0"/>
-    </w:rPr>
-  </w:style>
-  <w:style w:type="character" w:customStyle="1" w:styleId="StringTok">
-    <w:name w:val="StringTok"/>
-    <w:basedOn w:val="VerbatimChar"/>
-    <w:rPr>
-      <w:color w:val="4070a0"/>
-    </w:rPr>
-  </w:style>
-  <w:style w:type="character" w:customStyle="1" w:styleId="VerbatimStringTok">
-    <w:name w:val="VerbatimStringTok"/>
-    <w:basedOn w:val="VerbatimChar"/>
-    <w:rPr>
-      <w:color w:val="4070a0"/>
-    </w:rPr>
-  </w:style>
-  <w:style w:type="character" w:customStyle="1" w:styleId="SpecialStringTok">
-    <w:name w:val="SpecialStringTok"/>
-    <w:basedOn w:val="VerbatimChar"/>
-    <w:rPr>
-      <w:color w:val="bb6688"/>
-    </w:rPr>
-  </w:style>
-  <w:style w:type="character" w:customStyle="1" w:styleId="ImportTok">
-    <w:name w:val="ImportTok"/>
-    <w:basedOn w:val="VerbatimChar"/>
-    <w:rPr>
-      <w:b/>
-      <w:color w:val="008000"/>
-    </w:rPr>
-  </w:style>
-  <w:style w:type="character" w:customStyle="1" w:styleId="CommentTok">
-    <w:name w:val="CommentTok"/>
-    <w:basedOn w:val="VerbatimChar"/>
-    <w:rPr>
-      <w:i/>
-      <w:color w:val="60a0b0"/>
-    </w:rPr>
-  </w:style>
-  <w:style w:type="character" w:customStyle="1" w:styleId="DocumentationTok">
-    <w:name w:val="DocumentationTok"/>
-    <w:basedOn w:val="VerbatimChar"/>
-    <w:rPr>
-      <w:i/>
-      <w:color w:val="ba2121"/>
-    </w:rPr>
-  </w:style>
-  <w:style w:type="character" w:customStyle="1" w:styleId="AnnotationTok">
-    <w:name w:val="AnnotationTok"/>
-    <w:basedOn w:val="VerbatimChar"/>
-    <w:rPr>
-      <w:b/>
-      <w:i/>
-      <w:color w:val="60a0b0"/>
-    </w:rPr>
-  </w:style>
-  <w:style w:type="character" w:customStyle="1" w:styleId="CommentVarTok">
-    <w:name w:val="CommentVarTok"/>
-    <w:basedOn w:val="VerbatimChar"/>
-    <w:rPr>
-      <w:b/>
-      <w:i/>
-      <w:color w:val="60a0b0"/>
-    </w:rPr>
-  </w:style>
-  <w:style w:type="character" w:customStyle="1" w:styleId="OtherTok">
-    <w:name w:val="OtherTok"/>
-    <w:basedOn w:val="VerbatimChar"/>
-    <w:rPr>
-      <w:color w:val="007020"/>
-    </w:rPr>
-  </w:style>
-  <w:style w:type="character" w:customStyle="1" w:styleId="FunctionTok">
-    <w:name w:val="FunctionTok"/>
-    <w:basedOn w:val="VerbatimChar"/>
-    <w:rPr>
-      <w:color w:val="06287e"/>
-    </w:rPr>
-  </w:style>
-  <w:style w:type="character" w:customStyle="1" w:styleId="VariableTok">
-    <w:name w:val="VariableTok"/>
-    <w:basedOn w:val="VerbatimChar"/>
-    <w:rPr>
-      <w:color w:val="19177c"/>
-    </w:rPr>
-  </w:style>
-  <w:style w:type="character" w:customStyle="1" w:styleId="ControlFlowTok">
-    <w:name w:val="ControlFlowTok"/>
-    <w:basedOn w:val="VerbatimChar"/>
-    <w:rPr>
-      <w:b/>
-      <w:color w:val="007020"/>
-    </w:rPr>
-  </w:style>
-  <w:style w:type="character" w:customStyle="1" w:styleId="OperatorTok">
-    <w:name w:val="OperatorTok"/>
-    <w:basedOn w:val="VerbatimChar"/>
-    <w:rPr>
-      <w:color w:val="666666"/>
-    </w:rPr>
-  </w:style>
-  <w:style w:type="character" w:customStyle="1" w:styleId="BuiltInTok">
-    <w:name w:val="BuiltInTok"/>
-    <w:basedOn w:val="VerbatimChar"/>
-    <w:rPr>
-      <w:color w:val="008000"/>
-    </w:rPr>
-  </w:style>
-  <w:style w:type="character" w:customStyle="1" w:styleId="ExtensionTok">
-    <w:name w:val="ExtensionTok"/>
-    <w:basedOn w:val="VerbatimChar"/>
-    <w:rPr/>
-  </w:style>
-  <w:style w:type="character" w:customStyle="1" w:styleId="PreprocessorTok">
-    <w:name w:val="PreprocessorTok"/>
-    <w:basedOn w:val="VerbatimChar"/>
-    <w:rPr>
-      <w:color w:val="bc7a00"/>
-    </w:rPr>
-  </w:style>
-  <w:style w:type="character" w:customStyle="1" w:styleId="AttributeTok">
-    <w:name w:val="AttributeTok"/>
-    <w:basedOn w:val="VerbatimChar"/>
-    <w:rPr>
-      <w:color w:val="7d9029"/>
-    </w:rPr>
-  </w:style>
-  <w:style w:type="character" w:customStyle="1" w:styleId="RegionMarkerTok">
-    <w:name w:val="RegionMarkerTok"/>
-    <w:basedOn w:val="VerbatimChar"/>
-    <w:rPr/>
-  </w:style>
-  <w:style w:type="character" w:customStyle="1" w:styleId="InformationTok">
-    <w:name w:val="InformationTok"/>
-    <w:basedOn w:val="VerbatimChar"/>
-    <w:rPr>
-      <w:b/>
-      <w:i/>
-      <w:color w:val="60a0b0"/>
-    </w:rPr>
-  </w:style>
-  <w:style w:type="character" w:customStyle="1" w:styleId="WarningTok">
-    <w:name w:val="WarningTok"/>
-    <w:basedOn w:val="VerbatimChar"/>
-    <w:rPr>
-      <w:b/>
-      <w:i/>
-      <w:color w:val="60a0b0"/>
-    </w:rPr>
-  </w:style>
-  <w:style w:type="character" w:customStyle="1" w:styleId="AlertTok">
-    <w:name w:val="AlertTok"/>
-    <w:basedOn w:val="VerbatimChar"/>
-    <w:rPr>
-      <w:b/>
-      <w:color w:val="ff0000"/>
-    </w:rPr>
-  </w:style>
-  <w:style w:type="character" w:customStyle="1" w:styleId="ErrorTok">
-    <w:name w:val="ErrorTok"/>
-    <w:basedOn w:val="VerbatimChar"/>
-    <w:rPr>
-      <w:b/>
-      <w:color w:val="ff0000"/>
-    </w:rPr>
-  </w:style>
-  <w:style w:type="character" w:customStyle="1" w:styleId="NormalTok">
-    <w:name w:val="NormalTok"/>
-    <w:basedOn w:val="VerbatimChar"/>
-    <w:rPr/>
+      <w:color w:val="000000"/>
+    </w:rPr>
   </w:style>
 </w:styles>
 </file>

</xml_diff>

<commit_message>
Add cluster and API screenshots, remove separators and failed-run note
Co-Authored-By: Claude Code <noreply@anthropic.com>
</commit_message>
<xml_diff>
--- a/report/practical-report.docx
+++ b/report/practical-report.docx
@@ -2,7 +2,7 @@
 <file path=word/document.xml><?xml version="1.0" encoding="utf-8"?>
 <w:document xmlns:w="http://schemas.openxmlformats.org/wordprocessingml/2006/main" xmlns:m="http://schemas.openxmlformats.org/officeDocument/2006/math" xmlns:r="http://schemas.openxmlformats.org/officeDocument/2006/relationships" xmlns:o="urn:schemas-microsoft-com:office:office" xmlns:v="urn:schemas-microsoft-com:vml" xmlns:w10="urn:schemas-microsoft-com:office:word" xmlns:a="http://schemas.openxmlformats.org/drawingml/2006/main" xmlns:pic="http://schemas.openxmlformats.org/drawingml/2006/picture" xmlns:wp="http://schemas.openxmlformats.org/drawingml/2006/wordprocessingDrawing">
   <w:body>
-    <w:bookmarkStart w:id="29" w:name="X33245fbb24b90d793328635e71973c7629692ff"/>
+    <w:bookmarkStart w:id="35" w:name="X33245fbb24b90d793328635e71973c7629692ff"/>
     <w:p>
       <w:pPr>
         <w:pStyle w:val="Heading1"/>
@@ -996,7 +996,7 @@
       </w:r>
     </w:p>
     <w:bookmarkEnd w:id="15"/>
-    <w:bookmarkStart w:id="28" w:name="приложение-а.-скриншоты"/>
+    <w:bookmarkStart w:id="34" w:name="приложение-а.-скриншоты"/>
     <w:p>
       <w:pPr>
         <w:pStyle w:val="Heading2"/>
@@ -1227,77 +1227,116 @@
     </w:p>
     <w:p>
       <w:pPr>
-        <w:pStyle w:val="BodyText"/>
-      </w:pPr>
-      <w:r>
-        <w:t xml:space="preserve">Дополнительно после подъёма кластера снять:</w:t>
-      </w:r>
-      <w:r>
-        <w:t xml:space="preserve"> </w:t>
-      </w:r>
-      <w:r>
-        <w:rPr>
-          <w:rStyle w:val="VerbatimChar"/>
-        </w:rPr>
-        <w:t xml:space="preserve">kubectl get pods,svc -n iris</w:t>
-      </w:r>
-      <w:r>
-        <w:t xml:space="preserve"> </w:t>
-      </w:r>
-      <w:r>
-        <w:t xml:space="preserve">(</w:t>
-      </w:r>
-      <w:r>
-        <w:rPr>
-          <w:rStyle w:val="VerbatimChar"/>
-        </w:rPr>
-        <w:t xml:space="preserve">05-kubectl.png</w:t>
-      </w:r>
-      <w:r>
-        <w:t xml:space="preserve">), ответ</w:t>
-      </w:r>
-      <w:r>
-        <w:t xml:space="preserve"> </w:t>
-      </w:r>
-      <w:r>
-        <w:rPr>
-          <w:rStyle w:val="VerbatimChar"/>
-        </w:rPr>
-        <w:t xml:space="preserve">curl /predict</w:t>
-      </w:r>
-      <w:r>
-        <w:t xml:space="preserve"> </w:t>
-      </w:r>
-      <w:r>
-        <w:t xml:space="preserve">(</w:t>
-      </w:r>
-      <w:r>
-        <w:rPr>
-          <w:rStyle w:val="VerbatimChar"/>
-        </w:rPr>
-        <w:t xml:space="preserve">06-api.png</w:t>
-      </w:r>
-      <w:r>
-        <w:t xml:space="preserve">), красный запуск со</w:t>
-      </w:r>
-      <w:r>
-        <w:t xml:space="preserve"> </w:t>
-      </w:r>
-      <w:r>
-        <w:t xml:space="preserve">сломанным тестом (</w:t>
-      </w:r>
-      <w:r>
-        <w:rPr>
-          <w:rStyle w:val="VerbatimChar"/>
-        </w:rPr>
-        <w:t xml:space="preserve">07-failed-run.png</w:t>
-      </w:r>
-      <w:r>
-        <w:t xml:space="preserve">).</w:t>
-      </w:r>
-    </w:p>
-    <w:bookmarkEnd w:id="28"/>
-    <w:bookmarkEnd w:id="29"/>
+        <w:pStyle w:val="CaptionedFigure"/>
+      </w:pPr>
+      <w:r>
+        <w:drawing>
+          <wp:inline>
+            <wp:extent cx="5753100" cy="1424518"/>
+            <wp:effectExtent b="0" l="0" r="0" t="0"/>
+            <wp:docPr descr="Рисунок А.5. Состояние кластера: два пода Running 1/1, Service типа NodePort на порту 30080" title="" id="29" name="Picture"/>
+            <a:graphic>
+              <a:graphicData uri="http://schemas.openxmlformats.org/drawingml/2006/picture">
+                <pic:pic>
+                  <pic:nvPicPr>
+                    <pic:cNvPr descr="../docs/screenshots/05-kubectl.png" id="30" name="Picture"/>
+                    <pic:cNvPicPr>
+                      <a:picLocks noChangeArrowheads="1" noChangeAspect="1"/>
+                    </pic:cNvPicPr>
+                  </pic:nvPicPr>
+                  <pic:blipFill>
+                    <a:blip r:embed="rId28"/>
+                    <a:stretch>
+                      <a:fillRect/>
+                    </a:stretch>
+                  </pic:blipFill>
+                  <pic:spPr bwMode="auto">
+                    <a:xfrm>
+                      <a:off x="0" y="0"/>
+                      <a:ext cx="5753100" cy="1424518"/>
+                    </a:xfrm>
+                    <a:prstGeom prst="rect">
+                      <a:avLst/>
+                    </a:prstGeom>
+                    <a:noFill/>
+                    <a:ln w="9525">
+                      <a:noFill/>
+                      <a:headEnd/>
+                      <a:tailEnd/>
+                    </a:ln>
+                  </pic:spPr>
+                </pic:pic>
+              </a:graphicData>
+            </a:graphic>
+          </wp:inline>
+        </w:drawing>
+      </w:r>
+    </w:p>
+    <w:p>
+      <w:pPr>
+        <w:pStyle w:val="ImageCaption"/>
+      </w:pPr>
+      <w:r>
+        <w:t xml:space="preserve">Рисунок А.5. Состояние кластера: два пода Running 1/1, Service типа NodePort на порту 30080</w:t>
+      </w:r>
+    </w:p>
+    <w:p>
+      <w:pPr>
+        <w:pStyle w:val="CaptionedFigure"/>
+      </w:pPr>
+      <w:r>
+        <w:drawing>
+          <wp:inline>
+            <wp:extent cx="5753100" cy="778360"/>
+            <wp:effectExtent b="0" l="0" r="0" t="0"/>
+            <wp:docPr descr="Рисунок А.6. Ответ сервиса через Service: versicolor, уверенность 0.98" title="" id="32" name="Picture"/>
+            <a:graphic>
+              <a:graphicData uri="http://schemas.openxmlformats.org/drawingml/2006/picture">
+                <pic:pic>
+                  <pic:nvPicPr>
+                    <pic:cNvPr descr="../docs/screenshots/06-api.png" id="33" name="Picture"/>
+                    <pic:cNvPicPr>
+                      <a:picLocks noChangeArrowheads="1" noChangeAspect="1"/>
+                    </pic:cNvPicPr>
+                  </pic:nvPicPr>
+                  <pic:blipFill>
+                    <a:blip r:embed="rId31"/>
+                    <a:stretch>
+                      <a:fillRect/>
+                    </a:stretch>
+                  </pic:blipFill>
+                  <pic:spPr bwMode="auto">
+                    <a:xfrm>
+                      <a:off x="0" y="0"/>
+                      <a:ext cx="5753100" cy="778360"/>
+                    </a:xfrm>
+                    <a:prstGeom prst="rect">
+                      <a:avLst/>
+                    </a:prstGeom>
+                    <a:noFill/>
+                    <a:ln w="9525">
+                      <a:noFill/>
+                      <a:headEnd/>
+                      <a:tailEnd/>
+                    </a:ln>
+                  </pic:spPr>
+                </pic:pic>
+              </a:graphicData>
+            </a:graphic>
+          </wp:inline>
+        </w:drawing>
+      </w:r>
+    </w:p>
+    <w:p>
+      <w:pPr>
+        <w:pStyle w:val="ImageCaption"/>
+      </w:pPr>
+      <w:r>
+        <w:t xml:space="preserve">Рисунок А.6. Ответ сервиса через Service: versicolor, уверенность 0.98</w:t>
+      </w:r>
+    </w:p>
+    <w:bookmarkEnd w:id="34"/>
+    <w:bookmarkEnd w:id="35"/>
     <w:sectPr>
       <w:footnotePr>
         <w:numRestart w:val="eachSect"/>

</xml_diff>